<commit_message>
Mark user guide as MVP first release on cover and intro
Co-Authored-By: Claude Fable 5 <noreply@anthropic.com>
</commit_message>
<xml_diff>
--- a/docs/EngineerTrack-User-Guide.docx
+++ b/docs/EngineerTrack-User-Guide.docx
@@ -33,6 +33,22 @@
           <w:szCs w:val="48"/>
         </w:rPr>
         <w:t xml:space="preserve">User Guide</w:t>
+      </w:r>
+    </w:p>
+    <w:p>
+      <w:pPr>
+        <w:spacing w:before="200"/>
+        <w:jc w:val="center"/>
+      </w:pPr>
+      <w:r>
+        <w:rPr>
+          <w:b/>
+          <w:bCs/>
+          <w:color w:val="E65100"/>
+          <w:sz w:val="28"/>
+          <w:szCs w:val="28"/>
+        </w:rPr>
+        <w:t xml:space="preserve">MVP — First Release</w:t>
       </w:r>
     </w:p>
     <w:p>
@@ -110,6 +126,14 @@
       </w:pPr>
       <w:r>
         <w:t xml:space="preserve">EngineerTrack is a mobile application that helps engineering students document their internship day by day, while mentors and academic advisors review, rate, and validate that work. A gamification layer (XP points, levels, badges, and a leaderboard) keeps students motivated throughout the internship.</w:t>
+      </w:r>
+    </w:p>
+    <w:p>
+      <w:pPr>
+        <w:spacing w:after="160"/>
+      </w:pPr>
+      <w:r>
+        <w:t xml:space="preserve">This guide describes the first MVP (Minimum Viable Product) release of EngineerTrack. Some features shown as "Coming Soon" in the app (such as the daily survey and theme selection) are planned for future releases.</w:t>
       </w:r>
     </w:p>
     <w:p>

</xml_diff>